<commit_message>
Update Bible resource data for 2026-09-02 release
</commit_message>
<xml_diff>
--- a/eng/docx/55.content.docx
+++ b/eng/docx/55.content.docx
@@ -21772,7 +21772,25 @@
         <w:rPr>
           <w:lang w:val="en_US" w:bidi="en_US"/>
         </w:rPr>
-        <w:t>Stop here and look at a map of the area of the Mediterranean that shows Rome, where Paul is, Ephesus, where Timothy is, Thessalonica, Galatia, Dalmatia, and Troas, where Timothy needs to stop on the way to Rome. Pause this audio here.</w:t>
+        <w:t xml:space="preserve">Stop here and look at a map of the </w:t>
+      </w:r>
+      <w:hyperlink r:id="rId13">
+        <w:r>
+          <w:rPr>
+            <w:lang w:val="en_US" w:bidi="en_US"/>
+          </w:rPr>
+          <w:rPr>
+            <w:color w:val="0000EE"/>
+            <w:u w:val="single"/>
+          </w:rPr>
+          <w:t>area of the Mediterranean that shows Rome, where Paul is, Ephesus, where Timothy is, Thessalonica, Galatia, Dalmatia, and Troas, where Timothy needs to stop on the way to Rome</w:t>
+        </w:r>
+      </w:hyperlink>
+      <w:r>
+        <w:rPr>
+          <w:lang w:val="en_US" w:bidi="en_US"/>
+        </w:rPr>
+        <w:t>. Pause this audio here.</w:t>
       </w:r>
     </w:p>
     <w:p>
@@ -21856,7 +21874,61 @@
         <w:rPr>
           <w:lang w:val="en_US" w:bidi="en_US"/>
         </w:rPr>
-        <w:t>Stop here and look at photos of scrolls, parchment, and a cloak as a group. Pause this audio here.</w:t>
+        <w:t xml:space="preserve">Stop here and look at photos of </w:t>
+      </w:r>
+      <w:hyperlink r:id="rId14">
+        <w:r>
+          <w:rPr>
+            <w:lang w:val="en_US" w:bidi="en_US"/>
+          </w:rPr>
+          <w:rPr>
+            <w:color w:val="0000EE"/>
+            <w:u w:val="single"/>
+          </w:rPr>
+          <w:t>scrolls</w:t>
+        </w:r>
+      </w:hyperlink>
+      <w:r>
+        <w:rPr>
+          <w:lang w:val="en_US" w:bidi="en_US"/>
+        </w:rPr>
+        <w:t xml:space="preserve">, </w:t>
+      </w:r>
+      <w:hyperlink r:id="rId15">
+        <w:r>
+          <w:rPr>
+            <w:lang w:val="en_US" w:bidi="en_US"/>
+          </w:rPr>
+          <w:rPr>
+            <w:color w:val="0000EE"/>
+            <w:u w:val="single"/>
+          </w:rPr>
+          <w:t>parchment</w:t>
+        </w:r>
+      </w:hyperlink>
+      <w:r>
+        <w:rPr>
+          <w:lang w:val="en_US" w:bidi="en_US"/>
+        </w:rPr>
+        <w:t xml:space="preserve">, and a </w:t>
+      </w:r>
+      <w:hyperlink r:id="rId16">
+        <w:r>
+          <w:rPr>
+            <w:lang w:val="en_US" w:bidi="en_US"/>
+          </w:rPr>
+          <w:rPr>
+            <w:color w:val="0000EE"/>
+            <w:u w:val="single"/>
+          </w:rPr>
+          <w:t>cloak</w:t>
+        </w:r>
+      </w:hyperlink>
+      <w:r>
+        <w:rPr>
+          <w:lang w:val="en_US" w:bidi="en_US"/>
+        </w:rPr>
+        <w:t xml:space="preserve"> as a group. Pause this audio here.</w:t>
       </w:r>
     </w:p>
     <w:p>

</xml_diff>